<commit_message>
update documentation draft with new dataset
</commit_message>
<xml_diff>
--- a/artifacts/documentation_draft.docx
+++ b/artifacts/documentation_draft.docx
@@ -803,11 +803,19 @@
           <w:iCs/>
         </w:rPr>
       </w:pPr>
-      <w:r>
-        <w:rPr>
-          <w:rFonts w:ascii="Times New Roman" w:hAnsi="Times New Roman" w:cs="Times New Roman"/>
-        </w:rPr>
-        <w:t xml:space="preserve">Breiman (2001). </w:t>
+      <w:proofErr w:type="spellStart"/>
+      <w:r>
+        <w:rPr>
+          <w:rFonts w:ascii="Times New Roman" w:hAnsi="Times New Roman" w:cs="Times New Roman"/>
+        </w:rPr>
+        <w:t>Breiman</w:t>
+      </w:r>
+      <w:proofErr w:type="spellEnd"/>
+      <w:r>
+        <w:rPr>
+          <w:rFonts w:ascii="Times New Roman" w:hAnsi="Times New Roman" w:cs="Times New Roman"/>
+        </w:rPr>
+        <w:t xml:space="preserve"> (2001). </w:t>
       </w:r>
       <w:r>
         <w:rPr>
@@ -1958,7 +1966,7 @@
             <w:rStyle w:val="Hyperlink"/>
             <w:rFonts w:ascii="Times New Roman" w:hAnsi="Times New Roman" w:cs="Times New Roman"/>
           </w:rPr>
-          <w:t>https://www.kaggle.com/datasets/shariful07/student-mental-health</w:t>
+          <w:t>https://www.kaggle.com/datasets/hopesb/student-depression-dataset</w:t>
         </w:r>
       </w:hyperlink>
     </w:p>
@@ -1969,11 +1977,18 @@
           <w:rFonts w:ascii="Times New Roman" w:hAnsi="Times New Roman" w:cs="Times New Roman"/>
         </w:rPr>
       </w:pPr>
-      <w:r>
-        <w:rPr>
-          <w:rFonts w:ascii="Times New Roman" w:hAnsi="Times New Roman" w:cs="Times New Roman"/>
-        </w:rPr>
-        <w:lastRenderedPageBreak/>
+    </w:p>
+    <w:p>
+      <w:pPr>
+        <w:ind w:firstLine="720"/>
+        <w:rPr>
+          <w:rFonts w:ascii="Times New Roman" w:hAnsi="Times New Roman" w:cs="Times New Roman"/>
+        </w:rPr>
+      </w:pPr>
+      <w:r>
+        <w:rPr>
+          <w:rFonts w:ascii="Times New Roman" w:hAnsi="Times New Roman" w:cs="Times New Roman"/>
+        </w:rPr>
         <w:t>Characteristics</w:t>
       </w:r>
       <w:r>
@@ -2122,6 +2137,437 @@
         </w:rPr>
         <w:t>Mental health outcomes</w:t>
       </w:r>
+    </w:p>
+    <w:p>
+      <w:pPr>
+        <w:pStyle w:val="ListParagraph"/>
+        <w:rPr>
+          <w:rFonts w:ascii="Times New Roman" w:hAnsi="Times New Roman" w:cs="Times New Roman"/>
+        </w:rPr>
+      </w:pPr>
+    </w:p>
+    <w:p>
+      <w:pPr>
+        <w:ind w:left="720"/>
+        <w:rPr>
+          <w:rFonts w:ascii="Times New Roman" w:hAnsi="Times New Roman" w:cs="Times New Roman"/>
+        </w:rPr>
+      </w:pPr>
+      <w:r>
+        <w:rPr>
+          <w:rFonts w:ascii="Times New Roman" w:hAnsi="Times New Roman" w:cs="Times New Roman"/>
+        </w:rPr>
+        <w:t xml:space="preserve">3.  </w:t>
+      </w:r>
+      <w:r>
+        <w:rPr>
+          <w:rFonts w:ascii="Times New Roman" w:hAnsi="Times New Roman" w:cs="Times New Roman"/>
+          <w:b/>
+          <w:bCs/>
+        </w:rPr>
+        <w:t>Canadian Health Survey</w:t>
+      </w:r>
+    </w:p>
+    <w:p>
+      <w:pPr>
+        <w:rPr>
+          <w:rFonts w:ascii="Times New Roman" w:hAnsi="Times New Roman" w:cs="Times New Roman"/>
+        </w:rPr>
+      </w:pPr>
+      <w:r>
+        <w:rPr>
+          <w:rFonts w:ascii="Times New Roman" w:hAnsi="Times New Roman" w:cs="Times New Roman"/>
+        </w:rPr>
+        <w:t>Focus:</w:t>
+      </w:r>
+    </w:p>
+    <w:p>
+      <w:pPr>
+        <w:pStyle w:val="ListParagraph"/>
+        <w:numPr>
+          <w:ilvl w:val="0"/>
+          <w:numId w:val="16"/>
+        </w:numPr>
+        <w:rPr>
+          <w:rFonts w:ascii="Times New Roman" w:hAnsi="Times New Roman" w:cs="Times New Roman"/>
+        </w:rPr>
+      </w:pPr>
+      <w:r>
+        <w:rPr>
+          <w:rFonts w:ascii="Times New Roman" w:hAnsi="Times New Roman" w:cs="Times New Roman"/>
+        </w:rPr>
+        <w:t>well-being outcomes (</w:t>
+      </w:r>
+      <w:proofErr w:type="spellStart"/>
+      <w:r>
+        <w:rPr>
+          <w:rFonts w:ascii="Times New Roman" w:hAnsi="Times New Roman" w:cs="Times New Roman"/>
+        </w:rPr>
+        <w:t>Life_satisfaction</w:t>
+      </w:r>
+      <w:proofErr w:type="spellEnd"/>
+      <w:r>
+        <w:rPr>
+          <w:rFonts w:ascii="Times New Roman" w:hAnsi="Times New Roman" w:cs="Times New Roman"/>
+        </w:rPr>
+        <w:t xml:space="preserve">, </w:t>
+      </w:r>
+      <w:proofErr w:type="spellStart"/>
+      <w:r>
+        <w:rPr>
+          <w:rFonts w:ascii="Times New Roman" w:hAnsi="Times New Roman" w:cs="Times New Roman"/>
+        </w:rPr>
+        <w:t>Mental_health_state</w:t>
+      </w:r>
+      <w:proofErr w:type="spellEnd"/>
+      <w:r>
+        <w:rPr>
+          <w:rFonts w:ascii="Times New Roman" w:hAnsi="Times New Roman" w:cs="Times New Roman"/>
+        </w:rPr>
+        <w:t xml:space="preserve">, </w:t>
+      </w:r>
+      <w:proofErr w:type="spellStart"/>
+      <w:r>
+        <w:rPr>
+          <w:rFonts w:ascii="Times New Roman" w:hAnsi="Times New Roman" w:cs="Times New Roman"/>
+        </w:rPr>
+        <w:t>Stress_level</w:t>
+      </w:r>
+      <w:proofErr w:type="spellEnd"/>
+      <w:r>
+        <w:rPr>
+          <w:rFonts w:ascii="Times New Roman" w:hAnsi="Times New Roman" w:cs="Times New Roman"/>
+        </w:rPr>
+        <w:t xml:space="preserve">, </w:t>
+      </w:r>
+      <w:proofErr w:type="spellStart"/>
+      <w:r>
+        <w:rPr>
+          <w:rFonts w:ascii="Times New Roman" w:hAnsi="Times New Roman" w:cs="Times New Roman"/>
+        </w:rPr>
+        <w:t>Work_stress</w:t>
+      </w:r>
+      <w:proofErr w:type="spellEnd"/>
+      <w:r>
+        <w:rPr>
+          <w:rFonts w:ascii="Times New Roman" w:hAnsi="Times New Roman" w:cs="Times New Roman"/>
+        </w:rPr>
+        <w:t>)</w:t>
+      </w:r>
+    </w:p>
+    <w:p>
+      <w:pPr>
+        <w:pStyle w:val="ListParagraph"/>
+        <w:numPr>
+          <w:ilvl w:val="0"/>
+          <w:numId w:val="16"/>
+        </w:numPr>
+        <w:rPr>
+          <w:rFonts w:ascii="Times New Roman" w:hAnsi="Times New Roman" w:cs="Times New Roman"/>
+        </w:rPr>
+      </w:pPr>
+      <w:r>
+        <w:rPr>
+          <w:rFonts w:ascii="Times New Roman" w:hAnsi="Times New Roman" w:cs="Times New Roman"/>
+        </w:rPr>
+        <w:t>work/behavior predictors (</w:t>
+      </w:r>
+      <w:proofErr w:type="spellStart"/>
+      <w:r>
+        <w:rPr>
+          <w:rFonts w:ascii="Times New Roman" w:hAnsi="Times New Roman" w:cs="Times New Roman"/>
+        </w:rPr>
+        <w:t>Worked_job_business</w:t>
+      </w:r>
+      <w:proofErr w:type="spellEnd"/>
+      <w:r>
+        <w:rPr>
+          <w:rFonts w:ascii="Times New Roman" w:hAnsi="Times New Roman" w:cs="Times New Roman"/>
+        </w:rPr>
+        <w:t xml:space="preserve">, </w:t>
+      </w:r>
+      <w:proofErr w:type="spellStart"/>
+      <w:r>
+        <w:rPr>
+          <w:rFonts w:ascii="Times New Roman" w:hAnsi="Times New Roman" w:cs="Times New Roman"/>
+        </w:rPr>
+        <w:t>Work_hours</w:t>
+      </w:r>
+      <w:proofErr w:type="spellEnd"/>
+      <w:r>
+        <w:rPr>
+          <w:rFonts w:ascii="Times New Roman" w:hAnsi="Times New Roman" w:cs="Times New Roman"/>
+        </w:rPr>
+        <w:t xml:space="preserve">, </w:t>
+      </w:r>
+      <w:proofErr w:type="spellStart"/>
+      <w:r>
+        <w:rPr>
+          <w:rFonts w:ascii="Times New Roman" w:hAnsi="Times New Roman" w:cs="Times New Roman"/>
+        </w:rPr>
+        <w:t>Total_active_time</w:t>
+      </w:r>
+      <w:proofErr w:type="spellEnd"/>
+      <w:r>
+        <w:rPr>
+          <w:rFonts w:ascii="Times New Roman" w:hAnsi="Times New Roman" w:cs="Times New Roman"/>
+        </w:rPr>
+        <w:t>, smoking/alcohol/cannabis, food security, income)</w:t>
+      </w:r>
+    </w:p>
+    <w:p>
+      <w:pPr>
+        <w:pStyle w:val="ListParagraph"/>
+        <w:numPr>
+          <w:ilvl w:val="0"/>
+          <w:numId w:val="16"/>
+        </w:numPr>
+        <w:rPr>
+          <w:rFonts w:ascii="Times New Roman" w:hAnsi="Times New Roman" w:cs="Times New Roman"/>
+        </w:rPr>
+      </w:pPr>
+      <w:r>
+        <w:rPr>
+          <w:rFonts w:ascii="Times New Roman" w:hAnsi="Times New Roman" w:cs="Times New Roman"/>
+        </w:rPr>
+        <w:t>health conditions (</w:t>
+      </w:r>
+      <w:proofErr w:type="spellStart"/>
+      <w:r>
+        <w:rPr>
+          <w:rFonts w:ascii="Times New Roman" w:hAnsi="Times New Roman" w:cs="Times New Roman"/>
+        </w:rPr>
+        <w:t>Mood_disorder</w:t>
+      </w:r>
+      <w:proofErr w:type="spellEnd"/>
+      <w:r>
+        <w:rPr>
+          <w:rFonts w:ascii="Times New Roman" w:hAnsi="Times New Roman" w:cs="Times New Roman"/>
+        </w:rPr>
+        <w:t xml:space="preserve">, </w:t>
+      </w:r>
+      <w:proofErr w:type="spellStart"/>
+      <w:r>
+        <w:rPr>
+          <w:rFonts w:ascii="Times New Roman" w:hAnsi="Times New Roman" w:cs="Times New Roman"/>
+        </w:rPr>
+        <w:t>Anxiety_disorder</w:t>
+      </w:r>
+      <w:proofErr w:type="spellEnd"/>
+      <w:r>
+        <w:rPr>
+          <w:rFonts w:ascii="Times New Roman" w:hAnsi="Times New Roman" w:cs="Times New Roman"/>
+        </w:rPr>
+        <w:t>, chronic conditions)</w:t>
+      </w:r>
+    </w:p>
+    <w:p>
+      <w:pPr>
+        <w:pStyle w:val="ListParagraph"/>
+        <w:ind w:left="1080"/>
+        <w:rPr>
+          <w:rFonts w:ascii="Times New Roman" w:hAnsi="Times New Roman" w:cs="Times New Roman"/>
+        </w:rPr>
+      </w:pPr>
+    </w:p>
+    <w:p>
+      <w:pPr>
+        <w:rPr>
+          <w:rFonts w:ascii="Times New Roman" w:hAnsi="Times New Roman" w:cs="Times New Roman"/>
+        </w:rPr>
+      </w:pPr>
+      <w:r>
+        <w:rPr>
+          <w:rFonts w:ascii="Times New Roman" w:hAnsi="Times New Roman" w:cs="Times New Roman"/>
+        </w:rPr>
+        <w:t xml:space="preserve">Suitable for BN: </w:t>
+      </w:r>
+    </w:p>
+    <w:p>
+      <w:pPr>
+        <w:pStyle w:val="ListParagraph"/>
+        <w:numPr>
+          <w:ilvl w:val="0"/>
+          <w:numId w:val="51"/>
+        </w:numPr>
+        <w:rPr>
+          <w:rFonts w:ascii="Times New Roman" w:hAnsi="Times New Roman" w:cs="Times New Roman"/>
+        </w:rPr>
+      </w:pPr>
+      <w:r>
+        <w:rPr>
+          <w:rFonts w:ascii="Times New Roman" w:hAnsi="Times New Roman" w:cs="Times New Roman"/>
+        </w:rPr>
+        <w:t>columns are categorical/ordinal already (self-ratings, diagnoses yes/no, status categories)</w:t>
+      </w:r>
+    </w:p>
+    <w:p>
+      <w:pPr>
+        <w:rPr>
+          <w:rFonts w:ascii="Times New Roman" w:hAnsi="Times New Roman" w:cs="Times New Roman"/>
+        </w:rPr>
+      </w:pPr>
+      <w:r>
+        <w:rPr>
+          <w:rFonts w:ascii="Times New Roman" w:hAnsi="Times New Roman" w:cs="Times New Roman"/>
+        </w:rPr>
+        <w:t xml:space="preserve">Suitable for ML: </w:t>
+      </w:r>
+    </w:p>
+    <w:p>
+      <w:pPr>
+        <w:pStyle w:val="ListParagraph"/>
+        <w:numPr>
+          <w:ilvl w:val="0"/>
+          <w:numId w:val="16"/>
+        </w:numPr>
+        <w:rPr>
+          <w:rFonts w:ascii="Times New Roman" w:hAnsi="Times New Roman" w:cs="Times New Roman"/>
+        </w:rPr>
+      </w:pPr>
+      <w:r>
+        <w:rPr>
+          <w:rFonts w:ascii="Times New Roman" w:hAnsi="Times New Roman" w:cs="Times New Roman"/>
+        </w:rPr>
+        <w:t>binary outcomes (</w:t>
+      </w:r>
+      <w:proofErr w:type="spellStart"/>
+      <w:r>
+        <w:rPr>
+          <w:rFonts w:ascii="Times New Roman" w:hAnsi="Times New Roman" w:cs="Times New Roman"/>
+        </w:rPr>
+        <w:t>Mood_disorder</w:t>
+      </w:r>
+      <w:proofErr w:type="spellEnd"/>
+      <w:r>
+        <w:rPr>
+          <w:rFonts w:ascii="Times New Roman" w:hAnsi="Times New Roman" w:cs="Times New Roman"/>
+        </w:rPr>
+        <w:t xml:space="preserve">, </w:t>
+      </w:r>
+      <w:proofErr w:type="spellStart"/>
+      <w:r>
+        <w:rPr>
+          <w:rFonts w:ascii="Times New Roman" w:hAnsi="Times New Roman" w:cs="Times New Roman"/>
+        </w:rPr>
+        <w:t>Anxiety_disorder</w:t>
+      </w:r>
+      <w:proofErr w:type="spellEnd"/>
+      <w:r>
+        <w:rPr>
+          <w:rFonts w:ascii="Times New Roman" w:hAnsi="Times New Roman" w:cs="Times New Roman"/>
+        </w:rPr>
+        <w:t xml:space="preserve">, </w:t>
+      </w:r>
+      <w:proofErr w:type="spellStart"/>
+      <w:r>
+        <w:rPr>
+          <w:rFonts w:ascii="Times New Roman" w:hAnsi="Times New Roman" w:cs="Times New Roman"/>
+        </w:rPr>
+        <w:t>Sleep_apnea</w:t>
+      </w:r>
+      <w:proofErr w:type="spellEnd"/>
+      <w:r>
+        <w:rPr>
+          <w:rFonts w:ascii="Times New Roman" w:hAnsi="Times New Roman" w:cs="Times New Roman"/>
+        </w:rPr>
+        <w:t xml:space="preserve">…) </w:t>
+      </w:r>
+      <w:r>
+        <w:rPr>
+          <w:rFonts w:ascii="Times New Roman" w:hAnsi="Times New Roman" w:cs="Times New Roman"/>
+        </w:rPr>
+        <w:sym w:font="Wingdings" w:char="F0E0"/>
+      </w:r>
+      <w:r>
+        <w:rPr>
+          <w:rFonts w:ascii="Times New Roman" w:hAnsi="Times New Roman" w:cs="Times New Roman"/>
+        </w:rPr>
+        <w:t xml:space="preserve"> </w:t>
+      </w:r>
+      <w:r>
+        <w:rPr>
+          <w:rFonts w:ascii="Times New Roman" w:hAnsi="Times New Roman" w:cs="Times New Roman"/>
+        </w:rPr>
+        <w:t>logistic/RF/</w:t>
+      </w:r>
+      <w:proofErr w:type="spellStart"/>
+      <w:r>
+        <w:rPr>
+          <w:rFonts w:ascii="Times New Roman" w:hAnsi="Times New Roman" w:cs="Times New Roman"/>
+        </w:rPr>
+        <w:t>XGBoost</w:t>
+      </w:r>
+      <w:proofErr w:type="spellEnd"/>
+    </w:p>
+    <w:p>
+      <w:pPr>
+        <w:pStyle w:val="ListParagraph"/>
+        <w:numPr>
+          <w:ilvl w:val="0"/>
+          <w:numId w:val="16"/>
+        </w:numPr>
+        <w:rPr>
+          <w:rFonts w:ascii="Times New Roman" w:hAnsi="Times New Roman" w:cs="Times New Roman"/>
+        </w:rPr>
+      </w:pPr>
+      <w:r>
+        <w:rPr>
+          <w:rFonts w:ascii="Times New Roman" w:hAnsi="Times New Roman" w:cs="Times New Roman"/>
+        </w:rPr>
+        <w:t>ordinal/continuous outcomes (</w:t>
+      </w:r>
+      <w:proofErr w:type="spellStart"/>
+      <w:r>
+        <w:rPr>
+          <w:rFonts w:ascii="Times New Roman" w:hAnsi="Times New Roman" w:cs="Times New Roman"/>
+        </w:rPr>
+        <w:t>Life_satisfaction</w:t>
+      </w:r>
+      <w:proofErr w:type="spellEnd"/>
+      <w:r>
+        <w:rPr>
+          <w:rFonts w:ascii="Times New Roman" w:hAnsi="Times New Roman" w:cs="Times New Roman"/>
+        </w:rPr>
+        <w:t xml:space="preserve">, </w:t>
+      </w:r>
+      <w:r>
+        <w:rPr>
+          <w:rFonts w:ascii="Times New Roman" w:hAnsi="Times New Roman" w:cs="Times New Roman"/>
+        </w:rPr>
+        <w:t>Physical activity minutes</w:t>
+      </w:r>
+      <w:r>
+        <w:rPr>
+          <w:rFonts w:ascii="Times New Roman" w:hAnsi="Times New Roman" w:cs="Times New Roman"/>
+        </w:rPr>
+        <w:t xml:space="preserve">) </w:t>
+      </w:r>
+      <w:r>
+        <w:rPr>
+          <w:rFonts w:ascii="Times New Roman" w:hAnsi="Times New Roman" w:cs="Times New Roman"/>
+        </w:rPr>
+        <w:sym w:font="Wingdings" w:char="F0E0"/>
+      </w:r>
+      <w:r>
+        <w:rPr>
+          <w:rFonts w:ascii="Times New Roman" w:hAnsi="Times New Roman" w:cs="Times New Roman"/>
+        </w:rPr>
+        <w:t xml:space="preserve"> regression models</w:t>
+      </w:r>
+      <w:r>
+        <w:rPr>
+          <w:rFonts w:ascii="Times New Roman" w:hAnsi="Times New Roman" w:cs="Times New Roman"/>
+        </w:rPr>
+        <w:br/>
+      </w:r>
+    </w:p>
+    <w:p>
+      <w:pPr>
+        <w:rPr>
+          <w:rFonts w:ascii="Times New Roman" w:hAnsi="Times New Roman" w:cs="Times New Roman"/>
+        </w:rPr>
+      </w:pPr>
     </w:p>
     <w:p>
       <w:pPr>
@@ -2453,7 +2899,6 @@
         <w:rPr>
           <w:rFonts w:ascii="Times New Roman" w:hAnsi="Times New Roman" w:cs="Times New Roman"/>
         </w:rPr>
-        <w:lastRenderedPageBreak/>
         <w:t>Mental health index</w:t>
       </w:r>
     </w:p>
@@ -3123,8 +3568,16 @@
         <w:rPr>
           <w:rFonts w:ascii="Times New Roman" w:hAnsi="Times New Roman" w:cs="Times New Roman"/>
         </w:rPr>
-        <w:t xml:space="preserve"> regression (for work_interfere</w:t>
-      </w:r>
+        <w:t xml:space="preserve"> regression (for </w:t>
+      </w:r>
+      <w:proofErr w:type="spellStart"/>
+      <w:r>
+        <w:rPr>
+          <w:rFonts w:ascii="Times New Roman" w:hAnsi="Times New Roman" w:cs="Times New Roman"/>
+        </w:rPr>
+        <w:t>work_interfere</w:t>
+      </w:r>
+      <w:proofErr w:type="spellEnd"/>
       <w:r>
         <w:rPr>
           <w:rFonts w:ascii="Times New Roman" w:hAnsi="Times New Roman" w:cs="Times New Roman"/>
@@ -3205,8 +3658,35 @@
         <w:rPr>
           <w:rFonts w:ascii="Times New Roman" w:hAnsi="Times New Roman" w:cs="Times New Roman"/>
         </w:rPr>
-        <w:lastRenderedPageBreak/>
-        <w:t>Gradient Boosting (XGBoost / LightGBM)</w:t>
+        <w:t>Gradient Boosting (</w:t>
+      </w:r>
+      <w:proofErr w:type="spellStart"/>
+      <w:r>
+        <w:rPr>
+          <w:rFonts w:ascii="Times New Roman" w:hAnsi="Times New Roman" w:cs="Times New Roman"/>
+        </w:rPr>
+        <w:t>XGBoost</w:t>
+      </w:r>
+      <w:proofErr w:type="spellEnd"/>
+      <w:r>
+        <w:rPr>
+          <w:rFonts w:ascii="Times New Roman" w:hAnsi="Times New Roman" w:cs="Times New Roman"/>
+        </w:rPr>
+        <w:t xml:space="preserve"> / </w:t>
+      </w:r>
+      <w:proofErr w:type="spellStart"/>
+      <w:r>
+        <w:rPr>
+          <w:rFonts w:ascii="Times New Roman" w:hAnsi="Times New Roman" w:cs="Times New Roman"/>
+        </w:rPr>
+        <w:t>LightGBM</w:t>
+      </w:r>
+      <w:proofErr w:type="spellEnd"/>
+      <w:r>
+        <w:rPr>
+          <w:rFonts w:ascii="Times New Roman" w:hAnsi="Times New Roman" w:cs="Times New Roman"/>
+        </w:rPr>
+        <w:t>)</w:t>
       </w:r>
     </w:p>
     <w:p>
@@ -3301,7 +3781,21 @@
         <w:rPr>
           <w:rFonts w:ascii="Times New Roman" w:hAnsi="Times New Roman" w:cs="Times New Roman"/>
         </w:rPr>
-        <w:t xml:space="preserve"> XGBoost on residuals to capture nonlinear structure</w:t>
+        <w:t xml:space="preserve"> </w:t>
+      </w:r>
+      <w:proofErr w:type="spellStart"/>
+      <w:r>
+        <w:rPr>
+          <w:rFonts w:ascii="Times New Roman" w:hAnsi="Times New Roman" w:cs="Times New Roman"/>
+        </w:rPr>
+        <w:t>XGBoost</w:t>
+      </w:r>
+      <w:proofErr w:type="spellEnd"/>
+      <w:r>
+        <w:rPr>
+          <w:rFonts w:ascii="Times New Roman" w:hAnsi="Times New Roman" w:cs="Times New Roman"/>
+        </w:rPr>
+        <w:t xml:space="preserve"> on residuals to capture nonlinear structure</w:t>
       </w:r>
       <w:r>
         <w:rPr>
@@ -3454,6 +3948,7 @@
         <w:rPr>
           <w:rFonts w:ascii="Times New Roman" w:hAnsi="Times New Roman" w:cs="Times New Roman"/>
         </w:rPr>
+        <w:lastRenderedPageBreak/>
         <w:t>Missing</w:t>
       </w:r>
       <w:r>
@@ -3946,7 +4441,6 @@
           <w:b/>
           <w:bCs/>
         </w:rPr>
-        <w:lastRenderedPageBreak/>
         <w:t xml:space="preserve">Discretization </w:t>
       </w:r>
       <w:r>
@@ -4080,7 +4574,21 @@
         <w:rPr>
           <w:rFonts w:ascii="Times New Roman" w:hAnsi="Times New Roman" w:cs="Times New Roman"/>
         </w:rPr>
-        <w:t xml:space="preserve">feature selection pipeline (from RF/XGBoost) </w:t>
+        <w:t>feature selection pipeline (from RF/</w:t>
+      </w:r>
+      <w:proofErr w:type="spellStart"/>
+      <w:r>
+        <w:rPr>
+          <w:rFonts w:ascii="Times New Roman" w:hAnsi="Times New Roman" w:cs="Times New Roman"/>
+        </w:rPr>
+        <w:t>XGBoost</w:t>
+      </w:r>
+      <w:proofErr w:type="spellEnd"/>
+      <w:r>
+        <w:rPr>
+          <w:rFonts w:ascii="Times New Roman" w:hAnsi="Times New Roman" w:cs="Times New Roman"/>
+        </w:rPr>
+        <w:t xml:space="preserve">) </w:t>
       </w:r>
     </w:p>
     <w:p>
@@ -4183,6 +4691,7 @@
           <w:b/>
           <w:bCs/>
         </w:rPr>
+        <w:lastRenderedPageBreak/>
         <w:t>Probabilistic quality</w:t>
       </w:r>
     </w:p>
@@ -4266,7 +4775,21 @@
         <w:rPr>
           <w:rFonts w:ascii="Times New Roman" w:hAnsi="Times New Roman" w:cs="Times New Roman"/>
         </w:rPr>
-        <w:t>, feature importance (RF/GBoost), SHAP values</w:t>
+        <w:t>, feature importance (RF/</w:t>
+      </w:r>
+      <w:proofErr w:type="spellStart"/>
+      <w:r>
+        <w:rPr>
+          <w:rFonts w:ascii="Times New Roman" w:hAnsi="Times New Roman" w:cs="Times New Roman"/>
+        </w:rPr>
+        <w:t>GBoost</w:t>
+      </w:r>
+      <w:proofErr w:type="spellEnd"/>
+      <w:r>
+        <w:rPr>
+          <w:rFonts w:ascii="Times New Roman" w:hAnsi="Times New Roman" w:cs="Times New Roman"/>
+        </w:rPr>
+        <w:t>), SHAP values</w:t>
       </w:r>
     </w:p>
     <w:p>
@@ -4553,7 +5076,6 @@
           <w:sz w:val="28"/>
           <w:szCs w:val="28"/>
         </w:rPr>
-        <w:lastRenderedPageBreak/>
         <w:t>Implementation &amp; tools (Python)</w:t>
       </w:r>
     </w:p>
@@ -4727,6 +5249,7 @@
           <w:sz w:val="28"/>
           <w:szCs w:val="28"/>
         </w:rPr>
+        <w:lastRenderedPageBreak/>
         <w:t>Discussion &amp; Limitations</w:t>
       </w:r>
     </w:p>
@@ -4782,6 +5305,119 @@
 <file path=word/numbering.xml><?xml version="1.0" encoding="utf-8"?>
 <w:numbering xmlns:wpc="http://schemas.microsoft.com/office/word/2010/wordprocessingCanvas" xmlns:cx="http://schemas.microsoft.com/office/drawing/2014/chartex" xmlns:cx1="http://schemas.microsoft.com/office/drawing/2015/9/8/chartex" xmlns:cx2="http://schemas.microsoft.com/office/drawing/2015/10/21/chartex" xmlns:cx3="http://schemas.microsoft.com/office/drawing/2016/5/9/chartex" xmlns:cx4="http://schemas.microsoft.com/office/drawing/2016/5/10/chartex" xmlns:cx5="http://schemas.microsoft.com/office/drawing/2016/5/11/chartex" xmlns:cx6="http://schemas.microsoft.com/office/drawing/2016/5/12/chartex" xmlns:cx7="http://schemas.microsoft.com/office/drawing/2016/5/13/chartex" xmlns:cx8="http://schemas.microsoft.com/office/drawing/2016/5/14/chartex" xmlns:mc="http://schemas.openxmlformats.org/markup-compatibility/2006" xmlns:aink="http://schemas.microsoft.com/office/drawing/2016/ink" xmlns:am3d="http://schemas.microsoft.com/office/drawing/2017/model3d" xmlns:o="urn:schemas-microsoft-com:office:office" xmlns:oel="http://schemas.microsoft.com/office/2019/extlst" xmlns:r="http://schemas.openxmlformats.org/officeDocument/2006/relationships" xmlns:m="http://schemas.openxmlformats.org/officeDocument/2006/math" xmlns:v="urn:schemas-microsoft-com:vml" xmlns:wp14="http://schemas.microsoft.com/office/word/2010/wordprocessingDrawing" xmlns:wp="http://schemas.openxmlformats.org/drawingml/2006/wordprocessingDrawing" xmlns:w10="urn:schemas-microsoft-com:office:word" xmlns:w="http://schemas.openxmlformats.org/wordprocessingml/2006/main" xmlns:w14="http://schemas.microsoft.com/office/word/2010/wordml" xmlns:w15="http://schemas.microsoft.com/office/word/2012/wordml" xmlns:w16cex="http://schemas.microsoft.com/office/word/2018/wordml/cex" xmlns:w16cid="http://schemas.microsoft.com/office/word/2016/wordml/cid" xmlns:w16="http://schemas.microsoft.com/office/word/2018/wordml" xmlns:w16du="http://schemas.microsoft.com/office/word/2023/wordml/word16du" xmlns:w16sdtdh="http://schemas.microsoft.com/office/word/2020/wordml/sdtdatahash" xmlns:w16sdtfl="http://schemas.microsoft.com/office/word/2024/wordml/sdtformatlock" xmlns:w16se="http://schemas.microsoft.com/office/word/2015/wordml/symex" xmlns:wpg="http://schemas.microsoft.com/office/word/2010/wordprocessingGroup" xmlns:wpi="http://schemas.microsoft.com/office/word/2010/wordprocessingInk" xmlns:wne="http://schemas.microsoft.com/office/word/2006/wordml" xmlns:wps="http://schemas.microsoft.com/office/word/2010/wordprocessingShape" mc:Ignorable="w14 w15 w16se w16cid w16 w16cex w16sdtdh w16sdtfl w16du wp14">
   <w:abstractNum w:abstractNumId="0" w15:restartNumberingAfterBreak="0">
+    <w:nsid w:val="01583541"/>
+    <w:multiLevelType w:val="hybridMultilevel"/>
+    <w:tmpl w:val="9F4E1D68"/>
+    <w:lvl w:ilvl="0" w:tplc="04090001">
+      <w:start w:val="1"/>
+      <w:numFmt w:val="bullet"/>
+      <w:lvlText w:val=""/>
+      <w:lvlJc w:val="left"/>
+      <w:pPr>
+        <w:ind w:left="1440" w:hanging="360"/>
+      </w:pPr>
+      <w:rPr>
+        <w:rFonts w:ascii="Symbol" w:hAnsi="Symbol" w:hint="default"/>
+      </w:rPr>
+    </w:lvl>
+    <w:lvl w:ilvl="1" w:tplc="04090003" w:tentative="1">
+      <w:start w:val="1"/>
+      <w:numFmt w:val="bullet"/>
+      <w:lvlText w:val="o"/>
+      <w:lvlJc w:val="left"/>
+      <w:pPr>
+        <w:ind w:left="2160" w:hanging="360"/>
+      </w:pPr>
+      <w:rPr>
+        <w:rFonts w:ascii="Courier New" w:hAnsi="Courier New" w:cs="Courier New" w:hint="default"/>
+      </w:rPr>
+    </w:lvl>
+    <w:lvl w:ilvl="2" w:tplc="04090005" w:tentative="1">
+      <w:start w:val="1"/>
+      <w:numFmt w:val="bullet"/>
+      <w:lvlText w:val=""/>
+      <w:lvlJc w:val="left"/>
+      <w:pPr>
+        <w:ind w:left="2880" w:hanging="360"/>
+      </w:pPr>
+      <w:rPr>
+        <w:rFonts w:ascii="Wingdings" w:hAnsi="Wingdings" w:hint="default"/>
+      </w:rPr>
+    </w:lvl>
+    <w:lvl w:ilvl="3" w:tplc="04090001" w:tentative="1">
+      <w:start w:val="1"/>
+      <w:numFmt w:val="bullet"/>
+      <w:lvlText w:val=""/>
+      <w:lvlJc w:val="left"/>
+      <w:pPr>
+        <w:ind w:left="3600" w:hanging="360"/>
+      </w:pPr>
+      <w:rPr>
+        <w:rFonts w:ascii="Symbol" w:hAnsi="Symbol" w:hint="default"/>
+      </w:rPr>
+    </w:lvl>
+    <w:lvl w:ilvl="4" w:tplc="04090003" w:tentative="1">
+      <w:start w:val="1"/>
+      <w:numFmt w:val="bullet"/>
+      <w:lvlText w:val="o"/>
+      <w:lvlJc w:val="left"/>
+      <w:pPr>
+        <w:ind w:left="4320" w:hanging="360"/>
+      </w:pPr>
+      <w:rPr>
+        <w:rFonts w:ascii="Courier New" w:hAnsi="Courier New" w:cs="Courier New" w:hint="default"/>
+      </w:rPr>
+    </w:lvl>
+    <w:lvl w:ilvl="5" w:tplc="04090005" w:tentative="1">
+      <w:start w:val="1"/>
+      <w:numFmt w:val="bullet"/>
+      <w:lvlText w:val=""/>
+      <w:lvlJc w:val="left"/>
+      <w:pPr>
+        <w:ind w:left="5040" w:hanging="360"/>
+      </w:pPr>
+      <w:rPr>
+        <w:rFonts w:ascii="Wingdings" w:hAnsi="Wingdings" w:hint="default"/>
+      </w:rPr>
+    </w:lvl>
+    <w:lvl w:ilvl="6" w:tplc="04090001" w:tentative="1">
+      <w:start w:val="1"/>
+      <w:numFmt w:val="bullet"/>
+      <w:lvlText w:val=""/>
+      <w:lvlJc w:val="left"/>
+      <w:pPr>
+        <w:ind w:left="5760" w:hanging="360"/>
+      </w:pPr>
+      <w:rPr>
+        <w:rFonts w:ascii="Symbol" w:hAnsi="Symbol" w:hint="default"/>
+      </w:rPr>
+    </w:lvl>
+    <w:lvl w:ilvl="7" w:tplc="04090003" w:tentative="1">
+      <w:start w:val="1"/>
+      <w:numFmt w:val="bullet"/>
+      <w:lvlText w:val="o"/>
+      <w:lvlJc w:val="left"/>
+      <w:pPr>
+        <w:ind w:left="6480" w:hanging="360"/>
+      </w:pPr>
+      <w:rPr>
+        <w:rFonts w:ascii="Courier New" w:hAnsi="Courier New" w:cs="Courier New" w:hint="default"/>
+      </w:rPr>
+    </w:lvl>
+    <w:lvl w:ilvl="8" w:tplc="04090005" w:tentative="1">
+      <w:start w:val="1"/>
+      <w:numFmt w:val="bullet"/>
+      <w:lvlText w:val=""/>
+      <w:lvlJc w:val="left"/>
+      <w:pPr>
+        <w:ind w:left="7200" w:hanging="360"/>
+      </w:pPr>
+      <w:rPr>
+        <w:rFonts w:ascii="Wingdings" w:hAnsi="Wingdings" w:hint="default"/>
+      </w:rPr>
+    </w:lvl>
+  </w:abstractNum>
+  <w:abstractNum w:abstractNumId="1" w15:restartNumberingAfterBreak="0">
     <w:nsid w:val="01C166C8"/>
     <w:multiLevelType w:val="multilevel"/>
     <w:tmpl w:val="B71C5D80"/>
@@ -4930,7 +5566,7 @@
       </w:rPr>
     </w:lvl>
   </w:abstractNum>
-  <w:abstractNum w:abstractNumId="1" w15:restartNumberingAfterBreak="0">
+  <w:abstractNum w:abstractNumId="2" w15:restartNumberingAfterBreak="0">
     <w:nsid w:val="03214117"/>
     <w:multiLevelType w:val="multilevel"/>
     <w:tmpl w:val="9386062A"/>
@@ -5079,7 +5715,7 @@
       </w:rPr>
     </w:lvl>
   </w:abstractNum>
-  <w:abstractNum w:abstractNumId="2" w15:restartNumberingAfterBreak="0">
+  <w:abstractNum w:abstractNumId="3" w15:restartNumberingAfterBreak="0">
     <w:nsid w:val="066032DE"/>
     <w:multiLevelType w:val="multilevel"/>
     <w:tmpl w:val="D66C6830"/>
@@ -5196,7 +5832,7 @@
       </w:pPr>
     </w:lvl>
   </w:abstractNum>
-  <w:abstractNum w:abstractNumId="3" w15:restartNumberingAfterBreak="0">
+  <w:abstractNum w:abstractNumId="4" w15:restartNumberingAfterBreak="0">
     <w:nsid w:val="08B126D5"/>
     <w:multiLevelType w:val="multilevel"/>
     <w:tmpl w:val="F0DEF9DC"/>
@@ -5345,7 +5981,7 @@
       </w:rPr>
     </w:lvl>
   </w:abstractNum>
-  <w:abstractNum w:abstractNumId="4" w15:restartNumberingAfterBreak="0">
+  <w:abstractNum w:abstractNumId="5" w15:restartNumberingAfterBreak="0">
     <w:nsid w:val="08D74F08"/>
     <w:multiLevelType w:val="hybridMultilevel"/>
     <w:tmpl w:val="E3525E4E"/>
@@ -5434,7 +6070,7 @@
       </w:pPr>
     </w:lvl>
   </w:abstractNum>
-  <w:abstractNum w:abstractNumId="5" w15:restartNumberingAfterBreak="0">
+  <w:abstractNum w:abstractNumId="6" w15:restartNumberingAfterBreak="0">
     <w:nsid w:val="0CC51CD0"/>
     <w:multiLevelType w:val="multilevel"/>
     <w:tmpl w:val="07B60BB8"/>
@@ -5583,7 +6219,120 @@
       </w:rPr>
     </w:lvl>
   </w:abstractNum>
-  <w:abstractNum w:abstractNumId="6" w15:restartNumberingAfterBreak="0">
+  <w:abstractNum w:abstractNumId="7" w15:restartNumberingAfterBreak="0">
+    <w:nsid w:val="0EE35D2F"/>
+    <w:multiLevelType w:val="hybridMultilevel"/>
+    <w:tmpl w:val="5B0A0D7A"/>
+    <w:lvl w:ilvl="0" w:tplc="04090001">
+      <w:start w:val="1"/>
+      <w:numFmt w:val="bullet"/>
+      <w:lvlText w:val=""/>
+      <w:lvlJc w:val="left"/>
+      <w:pPr>
+        <w:ind w:left="720" w:hanging="360"/>
+      </w:pPr>
+      <w:rPr>
+        <w:rFonts w:ascii="Symbol" w:hAnsi="Symbol" w:hint="default"/>
+      </w:rPr>
+    </w:lvl>
+    <w:lvl w:ilvl="1" w:tplc="04090003" w:tentative="1">
+      <w:start w:val="1"/>
+      <w:numFmt w:val="bullet"/>
+      <w:lvlText w:val="o"/>
+      <w:lvlJc w:val="left"/>
+      <w:pPr>
+        <w:ind w:left="1440" w:hanging="360"/>
+      </w:pPr>
+      <w:rPr>
+        <w:rFonts w:ascii="Courier New" w:hAnsi="Courier New" w:cs="Courier New" w:hint="default"/>
+      </w:rPr>
+    </w:lvl>
+    <w:lvl w:ilvl="2" w:tplc="04090005" w:tentative="1">
+      <w:start w:val="1"/>
+      <w:numFmt w:val="bullet"/>
+      <w:lvlText w:val=""/>
+      <w:lvlJc w:val="left"/>
+      <w:pPr>
+        <w:ind w:left="2160" w:hanging="360"/>
+      </w:pPr>
+      <w:rPr>
+        <w:rFonts w:ascii="Wingdings" w:hAnsi="Wingdings" w:hint="default"/>
+      </w:rPr>
+    </w:lvl>
+    <w:lvl w:ilvl="3" w:tplc="04090001" w:tentative="1">
+      <w:start w:val="1"/>
+      <w:numFmt w:val="bullet"/>
+      <w:lvlText w:val=""/>
+      <w:lvlJc w:val="left"/>
+      <w:pPr>
+        <w:ind w:left="2880" w:hanging="360"/>
+      </w:pPr>
+      <w:rPr>
+        <w:rFonts w:ascii="Symbol" w:hAnsi="Symbol" w:hint="default"/>
+      </w:rPr>
+    </w:lvl>
+    <w:lvl w:ilvl="4" w:tplc="04090003" w:tentative="1">
+      <w:start w:val="1"/>
+      <w:numFmt w:val="bullet"/>
+      <w:lvlText w:val="o"/>
+      <w:lvlJc w:val="left"/>
+      <w:pPr>
+        <w:ind w:left="3600" w:hanging="360"/>
+      </w:pPr>
+      <w:rPr>
+        <w:rFonts w:ascii="Courier New" w:hAnsi="Courier New" w:cs="Courier New" w:hint="default"/>
+      </w:rPr>
+    </w:lvl>
+    <w:lvl w:ilvl="5" w:tplc="04090005" w:tentative="1">
+      <w:start w:val="1"/>
+      <w:numFmt w:val="bullet"/>
+      <w:lvlText w:val=""/>
+      <w:lvlJc w:val="left"/>
+      <w:pPr>
+        <w:ind w:left="4320" w:hanging="360"/>
+      </w:pPr>
+      <w:rPr>
+        <w:rFonts w:ascii="Wingdings" w:hAnsi="Wingdings" w:hint="default"/>
+      </w:rPr>
+    </w:lvl>
+    <w:lvl w:ilvl="6" w:tplc="04090001" w:tentative="1">
+      <w:start w:val="1"/>
+      <w:numFmt w:val="bullet"/>
+      <w:lvlText w:val=""/>
+      <w:lvlJc w:val="left"/>
+      <w:pPr>
+        <w:ind w:left="5040" w:hanging="360"/>
+      </w:pPr>
+      <w:rPr>
+        <w:rFonts w:ascii="Symbol" w:hAnsi="Symbol" w:hint="default"/>
+      </w:rPr>
+    </w:lvl>
+    <w:lvl w:ilvl="7" w:tplc="04090003" w:tentative="1">
+      <w:start w:val="1"/>
+      <w:numFmt w:val="bullet"/>
+      <w:lvlText w:val="o"/>
+      <w:lvlJc w:val="left"/>
+      <w:pPr>
+        <w:ind w:left="5760" w:hanging="360"/>
+      </w:pPr>
+      <w:rPr>
+        <w:rFonts w:ascii="Courier New" w:hAnsi="Courier New" w:cs="Courier New" w:hint="default"/>
+      </w:rPr>
+    </w:lvl>
+    <w:lvl w:ilvl="8" w:tplc="04090005" w:tentative="1">
+      <w:start w:val="1"/>
+      <w:numFmt w:val="bullet"/>
+      <w:lvlText w:val=""/>
+      <w:lvlJc w:val="left"/>
+      <w:pPr>
+        <w:ind w:left="6480" w:hanging="360"/>
+      </w:pPr>
+      <w:rPr>
+        <w:rFonts w:ascii="Wingdings" w:hAnsi="Wingdings" w:hint="default"/>
+      </w:rPr>
+    </w:lvl>
+  </w:abstractNum>
+  <w:abstractNum w:abstractNumId="8" w15:restartNumberingAfterBreak="0">
     <w:nsid w:val="0FDA4D81"/>
     <w:multiLevelType w:val="multilevel"/>
     <w:tmpl w:val="0B12260A"/>
@@ -5732,7 +6481,7 @@
       </w:rPr>
     </w:lvl>
   </w:abstractNum>
-  <w:abstractNum w:abstractNumId="7" w15:restartNumberingAfterBreak="0">
+  <w:abstractNum w:abstractNumId="9" w15:restartNumberingAfterBreak="0">
     <w:nsid w:val="13D32A8B"/>
     <w:multiLevelType w:val="multilevel"/>
     <w:tmpl w:val="9FA4C3CE"/>
@@ -5881,7 +6630,7 @@
       </w:rPr>
     </w:lvl>
   </w:abstractNum>
-  <w:abstractNum w:abstractNumId="8" w15:restartNumberingAfterBreak="0">
+  <w:abstractNum w:abstractNumId="10" w15:restartNumberingAfterBreak="0">
     <w:nsid w:val="1C59334A"/>
     <w:multiLevelType w:val="multilevel"/>
     <w:tmpl w:val="B688FD58"/>
@@ -6030,7 +6779,7 @@
       </w:rPr>
     </w:lvl>
   </w:abstractNum>
-  <w:abstractNum w:abstractNumId="9" w15:restartNumberingAfterBreak="0">
+  <w:abstractNum w:abstractNumId="11" w15:restartNumberingAfterBreak="0">
     <w:nsid w:val="1C8F6142"/>
     <w:multiLevelType w:val="multilevel"/>
     <w:tmpl w:val="C6E856A0"/>
@@ -6147,7 +6896,7 @@
       </w:pPr>
     </w:lvl>
   </w:abstractNum>
-  <w:abstractNum w:abstractNumId="10" w15:restartNumberingAfterBreak="0">
+  <w:abstractNum w:abstractNumId="12" w15:restartNumberingAfterBreak="0">
     <w:nsid w:val="1D131D2D"/>
     <w:multiLevelType w:val="multilevel"/>
     <w:tmpl w:val="F2400C1E"/>
@@ -6296,7 +7045,7 @@
       </w:rPr>
     </w:lvl>
   </w:abstractNum>
-  <w:abstractNum w:abstractNumId="11" w15:restartNumberingAfterBreak="0">
+  <w:abstractNum w:abstractNumId="13" w15:restartNumberingAfterBreak="0">
     <w:nsid w:val="1E1A6FD7"/>
     <w:multiLevelType w:val="multilevel"/>
     <w:tmpl w:val="B240CCCC"/>
@@ -6445,7 +7194,7 @@
       </w:rPr>
     </w:lvl>
   </w:abstractNum>
-  <w:abstractNum w:abstractNumId="12" w15:restartNumberingAfterBreak="0">
+  <w:abstractNum w:abstractNumId="14" w15:restartNumberingAfterBreak="0">
     <w:nsid w:val="21661176"/>
     <w:multiLevelType w:val="multilevel"/>
     <w:tmpl w:val="FB0CC88E"/>
@@ -6594,7 +7343,7 @@
       </w:rPr>
     </w:lvl>
   </w:abstractNum>
-  <w:abstractNum w:abstractNumId="13" w15:restartNumberingAfterBreak="0">
+  <w:abstractNum w:abstractNumId="15" w15:restartNumberingAfterBreak="0">
     <w:nsid w:val="21851ACE"/>
     <w:multiLevelType w:val="multilevel"/>
     <w:tmpl w:val="EAC08648"/>
@@ -6743,7 +7492,7 @@
       </w:rPr>
     </w:lvl>
   </w:abstractNum>
-  <w:abstractNum w:abstractNumId="14" w15:restartNumberingAfterBreak="0">
+  <w:abstractNum w:abstractNumId="16" w15:restartNumberingAfterBreak="0">
     <w:nsid w:val="23995DD9"/>
     <w:multiLevelType w:val="multilevel"/>
     <w:tmpl w:val="46FCA344"/>
@@ -6892,7 +7641,7 @@
       </w:rPr>
     </w:lvl>
   </w:abstractNum>
-  <w:abstractNum w:abstractNumId="15" w15:restartNumberingAfterBreak="0">
+  <w:abstractNum w:abstractNumId="17" w15:restartNumberingAfterBreak="0">
     <w:nsid w:val="268C78BA"/>
     <w:multiLevelType w:val="multilevel"/>
     <w:tmpl w:val="A05A2A34"/>
@@ -7041,7 +7790,7 @@
       </w:rPr>
     </w:lvl>
   </w:abstractNum>
-  <w:abstractNum w:abstractNumId="16" w15:restartNumberingAfterBreak="0">
+  <w:abstractNum w:abstractNumId="18" w15:restartNumberingAfterBreak="0">
     <w:nsid w:val="2E7F00E5"/>
     <w:multiLevelType w:val="multilevel"/>
     <w:tmpl w:val="177AF29C"/>
@@ -7190,7 +7939,120 @@
       </w:rPr>
     </w:lvl>
   </w:abstractNum>
-  <w:abstractNum w:abstractNumId="17" w15:restartNumberingAfterBreak="0">
+  <w:abstractNum w:abstractNumId="19" w15:restartNumberingAfterBreak="0">
+    <w:nsid w:val="307F2C0E"/>
+    <w:multiLevelType w:val="hybridMultilevel"/>
+    <w:tmpl w:val="BDFE7148"/>
+    <w:lvl w:ilvl="0" w:tplc="04090001">
+      <w:start w:val="1"/>
+      <w:numFmt w:val="bullet"/>
+      <w:lvlText w:val=""/>
+      <w:lvlJc w:val="left"/>
+      <w:pPr>
+        <w:ind w:left="1080" w:hanging="360"/>
+      </w:pPr>
+      <w:rPr>
+        <w:rFonts w:ascii="Symbol" w:hAnsi="Symbol" w:hint="default"/>
+      </w:rPr>
+    </w:lvl>
+    <w:lvl w:ilvl="1" w:tplc="04090003" w:tentative="1">
+      <w:start w:val="1"/>
+      <w:numFmt w:val="bullet"/>
+      <w:lvlText w:val="o"/>
+      <w:lvlJc w:val="left"/>
+      <w:pPr>
+        <w:ind w:left="1800" w:hanging="360"/>
+      </w:pPr>
+      <w:rPr>
+        <w:rFonts w:ascii="Courier New" w:hAnsi="Courier New" w:cs="Courier New" w:hint="default"/>
+      </w:rPr>
+    </w:lvl>
+    <w:lvl w:ilvl="2" w:tplc="04090005" w:tentative="1">
+      <w:start w:val="1"/>
+      <w:numFmt w:val="bullet"/>
+      <w:lvlText w:val=""/>
+      <w:lvlJc w:val="left"/>
+      <w:pPr>
+        <w:ind w:left="2520" w:hanging="360"/>
+      </w:pPr>
+      <w:rPr>
+        <w:rFonts w:ascii="Wingdings" w:hAnsi="Wingdings" w:hint="default"/>
+      </w:rPr>
+    </w:lvl>
+    <w:lvl w:ilvl="3" w:tplc="04090001" w:tentative="1">
+      <w:start w:val="1"/>
+      <w:numFmt w:val="bullet"/>
+      <w:lvlText w:val=""/>
+      <w:lvlJc w:val="left"/>
+      <w:pPr>
+        <w:ind w:left="3240" w:hanging="360"/>
+      </w:pPr>
+      <w:rPr>
+        <w:rFonts w:ascii="Symbol" w:hAnsi="Symbol" w:hint="default"/>
+      </w:rPr>
+    </w:lvl>
+    <w:lvl w:ilvl="4" w:tplc="04090003" w:tentative="1">
+      <w:start w:val="1"/>
+      <w:numFmt w:val="bullet"/>
+      <w:lvlText w:val="o"/>
+      <w:lvlJc w:val="left"/>
+      <w:pPr>
+        <w:ind w:left="3960" w:hanging="360"/>
+      </w:pPr>
+      <w:rPr>
+        <w:rFonts w:ascii="Courier New" w:hAnsi="Courier New" w:cs="Courier New" w:hint="default"/>
+      </w:rPr>
+    </w:lvl>
+    <w:lvl w:ilvl="5" w:tplc="04090005" w:tentative="1">
+      <w:start w:val="1"/>
+      <w:numFmt w:val="bullet"/>
+      <w:lvlText w:val=""/>
+      <w:lvlJc w:val="left"/>
+      <w:pPr>
+        <w:ind w:left="4680" w:hanging="360"/>
+      </w:pPr>
+      <w:rPr>
+        <w:rFonts w:ascii="Wingdings" w:hAnsi="Wingdings" w:hint="default"/>
+      </w:rPr>
+    </w:lvl>
+    <w:lvl w:ilvl="6" w:tplc="04090001" w:tentative="1">
+      <w:start w:val="1"/>
+      <w:numFmt w:val="bullet"/>
+      <w:lvlText w:val=""/>
+      <w:lvlJc w:val="left"/>
+      <w:pPr>
+        <w:ind w:left="5400" w:hanging="360"/>
+      </w:pPr>
+      <w:rPr>
+        <w:rFonts w:ascii="Symbol" w:hAnsi="Symbol" w:hint="default"/>
+      </w:rPr>
+    </w:lvl>
+    <w:lvl w:ilvl="7" w:tplc="04090003" w:tentative="1">
+      <w:start w:val="1"/>
+      <w:numFmt w:val="bullet"/>
+      <w:lvlText w:val="o"/>
+      <w:lvlJc w:val="left"/>
+      <w:pPr>
+        <w:ind w:left="6120" w:hanging="360"/>
+      </w:pPr>
+      <w:rPr>
+        <w:rFonts w:ascii="Courier New" w:hAnsi="Courier New" w:cs="Courier New" w:hint="default"/>
+      </w:rPr>
+    </w:lvl>
+    <w:lvl w:ilvl="8" w:tplc="04090005" w:tentative="1">
+      <w:start w:val="1"/>
+      <w:numFmt w:val="bullet"/>
+      <w:lvlText w:val=""/>
+      <w:lvlJc w:val="left"/>
+      <w:pPr>
+        <w:ind w:left="6840" w:hanging="360"/>
+      </w:pPr>
+      <w:rPr>
+        <w:rFonts w:ascii="Wingdings" w:hAnsi="Wingdings" w:hint="default"/>
+      </w:rPr>
+    </w:lvl>
+  </w:abstractNum>
+  <w:abstractNum w:abstractNumId="20" w15:restartNumberingAfterBreak="0">
     <w:nsid w:val="32C31F5D"/>
     <w:multiLevelType w:val="multilevel"/>
     <w:tmpl w:val="B2DE7DE6"/>
@@ -7339,7 +8201,7 @@
       </w:rPr>
     </w:lvl>
   </w:abstractNum>
-  <w:abstractNum w:abstractNumId="18" w15:restartNumberingAfterBreak="0">
+  <w:abstractNum w:abstractNumId="21" w15:restartNumberingAfterBreak="0">
     <w:nsid w:val="3BD17814"/>
     <w:multiLevelType w:val="multilevel"/>
     <w:tmpl w:val="C90C5786"/>
@@ -7488,7 +8350,7 @@
       </w:rPr>
     </w:lvl>
   </w:abstractNum>
-  <w:abstractNum w:abstractNumId="19" w15:restartNumberingAfterBreak="0">
+  <w:abstractNum w:abstractNumId="22" w15:restartNumberingAfterBreak="0">
     <w:nsid w:val="3E700496"/>
     <w:multiLevelType w:val="multilevel"/>
     <w:tmpl w:val="45B6B05E"/>
@@ -7637,7 +8499,7 @@
       </w:rPr>
     </w:lvl>
   </w:abstractNum>
-  <w:abstractNum w:abstractNumId="20" w15:restartNumberingAfterBreak="0">
+  <w:abstractNum w:abstractNumId="23" w15:restartNumberingAfterBreak="0">
     <w:nsid w:val="3F667B06"/>
     <w:multiLevelType w:val="multilevel"/>
     <w:tmpl w:val="EAD200AE"/>
@@ -7786,7 +8648,7 @@
       </w:rPr>
     </w:lvl>
   </w:abstractNum>
-  <w:abstractNum w:abstractNumId="21" w15:restartNumberingAfterBreak="0">
+  <w:abstractNum w:abstractNumId="24" w15:restartNumberingAfterBreak="0">
     <w:nsid w:val="41F210A2"/>
     <w:multiLevelType w:val="multilevel"/>
     <w:tmpl w:val="A1107850"/>
@@ -7935,7 +8797,7 @@
       </w:rPr>
     </w:lvl>
   </w:abstractNum>
-  <w:abstractNum w:abstractNumId="22" w15:restartNumberingAfterBreak="0">
+  <w:abstractNum w:abstractNumId="25" w15:restartNumberingAfterBreak="0">
     <w:nsid w:val="438757E5"/>
     <w:multiLevelType w:val="multilevel"/>
     <w:tmpl w:val="8858126A"/>
@@ -8084,7 +8946,7 @@
       </w:rPr>
     </w:lvl>
   </w:abstractNum>
-  <w:abstractNum w:abstractNumId="23" w15:restartNumberingAfterBreak="0">
+  <w:abstractNum w:abstractNumId="26" w15:restartNumberingAfterBreak="0">
     <w:nsid w:val="4546594F"/>
     <w:multiLevelType w:val="multilevel"/>
     <w:tmpl w:val="0D58475E"/>
@@ -8233,7 +9095,7 @@
       </w:rPr>
     </w:lvl>
   </w:abstractNum>
-  <w:abstractNum w:abstractNumId="24" w15:restartNumberingAfterBreak="0">
+  <w:abstractNum w:abstractNumId="27" w15:restartNumberingAfterBreak="0">
     <w:nsid w:val="45F220CF"/>
     <w:multiLevelType w:val="multilevel"/>
     <w:tmpl w:val="CA7C8B5C"/>
@@ -8382,7 +9244,7 @@
       </w:rPr>
     </w:lvl>
   </w:abstractNum>
-  <w:abstractNum w:abstractNumId="25" w15:restartNumberingAfterBreak="0">
+  <w:abstractNum w:abstractNumId="28" w15:restartNumberingAfterBreak="0">
     <w:nsid w:val="480C3FEF"/>
     <w:multiLevelType w:val="multilevel"/>
     <w:tmpl w:val="0D3AC01A"/>
@@ -8531,7 +9393,7 @@
       </w:rPr>
     </w:lvl>
   </w:abstractNum>
-  <w:abstractNum w:abstractNumId="26" w15:restartNumberingAfterBreak="0">
+  <w:abstractNum w:abstractNumId="29" w15:restartNumberingAfterBreak="0">
     <w:nsid w:val="48121F76"/>
     <w:multiLevelType w:val="multilevel"/>
     <w:tmpl w:val="76AE5D6E"/>
@@ -8680,7 +9542,7 @@
       </w:rPr>
     </w:lvl>
   </w:abstractNum>
-  <w:abstractNum w:abstractNumId="27" w15:restartNumberingAfterBreak="0">
+  <w:abstractNum w:abstractNumId="30" w15:restartNumberingAfterBreak="0">
     <w:nsid w:val="4A9E42F4"/>
     <w:multiLevelType w:val="multilevel"/>
     <w:tmpl w:val="A16C394E"/>
@@ -8829,7 +9691,7 @@
       </w:rPr>
     </w:lvl>
   </w:abstractNum>
-  <w:abstractNum w:abstractNumId="28" w15:restartNumberingAfterBreak="0">
+  <w:abstractNum w:abstractNumId="31" w15:restartNumberingAfterBreak="0">
     <w:nsid w:val="4C8C64DF"/>
     <w:multiLevelType w:val="multilevel"/>
     <w:tmpl w:val="1E724F24"/>
@@ -8978,7 +9840,7 @@
       </w:rPr>
     </w:lvl>
   </w:abstractNum>
-  <w:abstractNum w:abstractNumId="29" w15:restartNumberingAfterBreak="0">
+  <w:abstractNum w:abstractNumId="32" w15:restartNumberingAfterBreak="0">
     <w:nsid w:val="51560664"/>
     <w:multiLevelType w:val="multilevel"/>
     <w:tmpl w:val="A00A2E4E"/>
@@ -9127,7 +9989,7 @@
       </w:rPr>
     </w:lvl>
   </w:abstractNum>
-  <w:abstractNum w:abstractNumId="30" w15:restartNumberingAfterBreak="0">
+  <w:abstractNum w:abstractNumId="33" w15:restartNumberingAfterBreak="0">
     <w:nsid w:val="53676A43"/>
     <w:multiLevelType w:val="multilevel"/>
     <w:tmpl w:val="B414099E"/>
@@ -9276,7 +10138,7 @@
       </w:rPr>
     </w:lvl>
   </w:abstractNum>
-  <w:abstractNum w:abstractNumId="31" w15:restartNumberingAfterBreak="0">
+  <w:abstractNum w:abstractNumId="34" w15:restartNumberingAfterBreak="0">
     <w:nsid w:val="59932AF6"/>
     <w:multiLevelType w:val="multilevel"/>
     <w:tmpl w:val="B94AC316"/>
@@ -9425,7 +10287,7 @@
       </w:rPr>
     </w:lvl>
   </w:abstractNum>
-  <w:abstractNum w:abstractNumId="32" w15:restartNumberingAfterBreak="0">
+  <w:abstractNum w:abstractNumId="35" w15:restartNumberingAfterBreak="0">
     <w:nsid w:val="5A832E0A"/>
     <w:multiLevelType w:val="multilevel"/>
     <w:tmpl w:val="F7C6F47C"/>
@@ -9574,7 +10436,7 @@
       </w:rPr>
     </w:lvl>
   </w:abstractNum>
-  <w:abstractNum w:abstractNumId="33" w15:restartNumberingAfterBreak="0">
+  <w:abstractNum w:abstractNumId="36" w15:restartNumberingAfterBreak="0">
     <w:nsid w:val="5D734971"/>
     <w:multiLevelType w:val="multilevel"/>
     <w:tmpl w:val="78D6267E"/>
@@ -9723,7 +10585,7 @@
       </w:rPr>
     </w:lvl>
   </w:abstractNum>
-  <w:abstractNum w:abstractNumId="34" w15:restartNumberingAfterBreak="0">
+  <w:abstractNum w:abstractNumId="37" w15:restartNumberingAfterBreak="0">
     <w:nsid w:val="60417458"/>
     <w:multiLevelType w:val="multilevel"/>
     <w:tmpl w:val="36C0DBE2"/>
@@ -9872,7 +10734,7 @@
       </w:rPr>
     </w:lvl>
   </w:abstractNum>
-  <w:abstractNum w:abstractNumId="35" w15:restartNumberingAfterBreak="0">
+  <w:abstractNum w:abstractNumId="38" w15:restartNumberingAfterBreak="0">
     <w:nsid w:val="60E34119"/>
     <w:multiLevelType w:val="multilevel"/>
     <w:tmpl w:val="2B20F7AA"/>
@@ -10021,7 +10883,7 @@
       </w:rPr>
     </w:lvl>
   </w:abstractNum>
-  <w:abstractNum w:abstractNumId="36" w15:restartNumberingAfterBreak="0">
+  <w:abstractNum w:abstractNumId="39" w15:restartNumberingAfterBreak="0">
     <w:nsid w:val="60E45F97"/>
     <w:multiLevelType w:val="multilevel"/>
     <w:tmpl w:val="D18C8764"/>
@@ -10170,7 +11032,7 @@
       </w:rPr>
     </w:lvl>
   </w:abstractNum>
-  <w:abstractNum w:abstractNumId="37" w15:restartNumberingAfterBreak="0">
+  <w:abstractNum w:abstractNumId="40" w15:restartNumberingAfterBreak="0">
     <w:nsid w:val="63FE63FB"/>
     <w:multiLevelType w:val="hybridMultilevel"/>
     <w:tmpl w:val="D2DA792C"/>
@@ -10259,7 +11121,7 @@
       </w:pPr>
     </w:lvl>
   </w:abstractNum>
-  <w:abstractNum w:abstractNumId="38" w15:restartNumberingAfterBreak="0">
+  <w:abstractNum w:abstractNumId="41" w15:restartNumberingAfterBreak="0">
     <w:nsid w:val="65680911"/>
     <w:multiLevelType w:val="multilevel"/>
     <w:tmpl w:val="25C8F43E"/>
@@ -10408,7 +11270,7 @@
       </w:rPr>
     </w:lvl>
   </w:abstractNum>
-  <w:abstractNum w:abstractNumId="39" w15:restartNumberingAfterBreak="0">
+  <w:abstractNum w:abstractNumId="42" w15:restartNumberingAfterBreak="0">
     <w:nsid w:val="673B1491"/>
     <w:multiLevelType w:val="multilevel"/>
     <w:tmpl w:val="85546196"/>
@@ -10557,7 +11419,7 @@
       </w:rPr>
     </w:lvl>
   </w:abstractNum>
-  <w:abstractNum w:abstractNumId="40" w15:restartNumberingAfterBreak="0">
+  <w:abstractNum w:abstractNumId="43" w15:restartNumberingAfterBreak="0">
     <w:nsid w:val="67F5699A"/>
     <w:multiLevelType w:val="multilevel"/>
     <w:tmpl w:val="0BEEFB7C"/>
@@ -10706,7 +11568,7 @@
       </w:rPr>
     </w:lvl>
   </w:abstractNum>
-  <w:abstractNum w:abstractNumId="41" w15:restartNumberingAfterBreak="0">
+  <w:abstractNum w:abstractNumId="44" w15:restartNumberingAfterBreak="0">
     <w:nsid w:val="6BA31DF2"/>
     <w:multiLevelType w:val="multilevel"/>
     <w:tmpl w:val="160AC172"/>
@@ -10855,7 +11717,7 @@
       </w:rPr>
     </w:lvl>
   </w:abstractNum>
-  <w:abstractNum w:abstractNumId="42" w15:restartNumberingAfterBreak="0">
+  <w:abstractNum w:abstractNumId="45" w15:restartNumberingAfterBreak="0">
     <w:nsid w:val="713B2F77"/>
     <w:multiLevelType w:val="multilevel"/>
     <w:tmpl w:val="2F2C1E64"/>
@@ -11004,7 +11866,7 @@
       </w:rPr>
     </w:lvl>
   </w:abstractNum>
-  <w:abstractNum w:abstractNumId="43" w15:restartNumberingAfterBreak="0">
+  <w:abstractNum w:abstractNumId="46" w15:restartNumberingAfterBreak="0">
     <w:nsid w:val="74EE0D45"/>
     <w:multiLevelType w:val="multilevel"/>
     <w:tmpl w:val="911C6DB6"/>
@@ -11153,7 +12015,7 @@
       </w:rPr>
     </w:lvl>
   </w:abstractNum>
-  <w:abstractNum w:abstractNumId="44" w15:restartNumberingAfterBreak="0">
+  <w:abstractNum w:abstractNumId="47" w15:restartNumberingAfterBreak="0">
     <w:nsid w:val="75324A35"/>
     <w:multiLevelType w:val="multilevel"/>
     <w:tmpl w:val="3C168884"/>
@@ -11302,7 +12164,7 @@
       </w:rPr>
     </w:lvl>
   </w:abstractNum>
-  <w:abstractNum w:abstractNumId="45" w15:restartNumberingAfterBreak="0">
+  <w:abstractNum w:abstractNumId="48" w15:restartNumberingAfterBreak="0">
     <w:nsid w:val="790F00F5"/>
     <w:multiLevelType w:val="multilevel"/>
     <w:tmpl w:val="B7967FD8"/>
@@ -11451,7 +12313,7 @@
       </w:rPr>
     </w:lvl>
   </w:abstractNum>
-  <w:abstractNum w:abstractNumId="46" w15:restartNumberingAfterBreak="0">
+  <w:abstractNum w:abstractNumId="49" w15:restartNumberingAfterBreak="0">
     <w:nsid w:val="7E060B43"/>
     <w:multiLevelType w:val="multilevel"/>
     <w:tmpl w:val="8C30A650"/>
@@ -11600,7 +12462,7 @@
       </w:rPr>
     </w:lvl>
   </w:abstractNum>
-  <w:abstractNum w:abstractNumId="47" w15:restartNumberingAfterBreak="0">
+  <w:abstractNum w:abstractNumId="50" w15:restartNumberingAfterBreak="0">
     <w:nsid w:val="7F3B5E27"/>
     <w:multiLevelType w:val="multilevel"/>
     <w:tmpl w:val="710693D6"/>
@@ -11750,148 +12612,157 @@
     </w:lvl>
   </w:abstractNum>
   <w:num w:numId="1" w16cid:durableId="1986004720">
+    <w:abstractNumId w:val="35"/>
+  </w:num>
+  <w:num w:numId="2" w16cid:durableId="2121340463">
+    <w:abstractNumId w:val="38"/>
+  </w:num>
+  <w:num w:numId="3" w16cid:durableId="1076393840">
+    <w:abstractNumId w:val="20"/>
+  </w:num>
+  <w:num w:numId="4" w16cid:durableId="1191407449">
+    <w:abstractNumId w:val="43"/>
+  </w:num>
+  <w:num w:numId="5" w16cid:durableId="1227767612">
+    <w:abstractNumId w:val="1"/>
+  </w:num>
+  <w:num w:numId="6" w16cid:durableId="1946379767">
+    <w:abstractNumId w:val="18"/>
+  </w:num>
+  <w:num w:numId="7" w16cid:durableId="152913838">
+    <w:abstractNumId w:val="6"/>
+  </w:num>
+  <w:num w:numId="8" w16cid:durableId="1511604633">
+    <w:abstractNumId w:val="11"/>
+  </w:num>
+  <w:num w:numId="9" w16cid:durableId="553664727">
+    <w:abstractNumId w:val="33"/>
+  </w:num>
+  <w:num w:numId="10" w16cid:durableId="606348142">
+    <w:abstractNumId w:val="28"/>
+  </w:num>
+  <w:num w:numId="11" w16cid:durableId="1441602055">
+    <w:abstractNumId w:val="47"/>
+  </w:num>
+  <w:num w:numId="12" w16cid:durableId="1426800143">
+    <w:abstractNumId w:val="27"/>
+  </w:num>
+  <w:num w:numId="13" w16cid:durableId="626352584">
+    <w:abstractNumId w:val="5"/>
+  </w:num>
+  <w:num w:numId="14" w16cid:durableId="533227730">
+    <w:abstractNumId w:val="45"/>
+  </w:num>
+  <w:num w:numId="15" w16cid:durableId="1786315709">
+    <w:abstractNumId w:val="2"/>
+  </w:num>
+  <w:num w:numId="16" w16cid:durableId="988437533">
+    <w:abstractNumId w:val="17"/>
+  </w:num>
+  <w:num w:numId="17" w16cid:durableId="1370494364">
+    <w:abstractNumId w:val="10"/>
+  </w:num>
+  <w:num w:numId="18" w16cid:durableId="79714287">
+    <w:abstractNumId w:val="24"/>
+  </w:num>
+  <w:num w:numId="19" w16cid:durableId="243147022">
+    <w:abstractNumId w:val="21"/>
+  </w:num>
+  <w:num w:numId="20" w16cid:durableId="1300069373">
+    <w:abstractNumId w:val="31"/>
+  </w:num>
+  <w:num w:numId="21" w16cid:durableId="641036489">
+    <w:abstractNumId w:val="3"/>
+  </w:num>
+  <w:num w:numId="22" w16cid:durableId="618924859">
+    <w:abstractNumId w:val="12"/>
+  </w:num>
+  <w:num w:numId="23" w16cid:durableId="134833155">
+    <w:abstractNumId w:val="50"/>
+  </w:num>
+  <w:num w:numId="24" w16cid:durableId="239676937">
+    <w:abstractNumId w:val="4"/>
+  </w:num>
+  <w:num w:numId="25" w16cid:durableId="1881241021">
     <w:abstractNumId w:val="32"/>
   </w:num>
-  <w:num w:numId="2" w16cid:durableId="2121340463">
-    <w:abstractNumId w:val="35"/>
+  <w:num w:numId="26" w16cid:durableId="915165430">
+    <w:abstractNumId w:val="14"/>
   </w:num>
-  <w:num w:numId="3" w16cid:durableId="1076393840">
-    <w:abstractNumId w:val="17"/>
+  <w:num w:numId="27" w16cid:durableId="1927374085">
+    <w:abstractNumId w:val="16"/>
   </w:num>
-  <w:num w:numId="4" w16cid:durableId="1191407449">
+  <w:num w:numId="28" w16cid:durableId="1960259249">
+    <w:abstractNumId w:val="30"/>
+  </w:num>
+  <w:num w:numId="29" w16cid:durableId="836113632">
+    <w:abstractNumId w:val="46"/>
+  </w:num>
+  <w:num w:numId="30" w16cid:durableId="1985085924">
+    <w:abstractNumId w:val="44"/>
+  </w:num>
+  <w:num w:numId="31" w16cid:durableId="670451960">
+    <w:abstractNumId w:val="13"/>
+  </w:num>
+  <w:num w:numId="32" w16cid:durableId="989790267">
+    <w:abstractNumId w:val="41"/>
+  </w:num>
+  <w:num w:numId="33" w16cid:durableId="1605652317">
+    <w:abstractNumId w:val="25"/>
+  </w:num>
+  <w:num w:numId="34" w16cid:durableId="529029301">
+    <w:abstractNumId w:val="26"/>
+  </w:num>
+  <w:num w:numId="35" w16cid:durableId="1132821015">
+    <w:abstractNumId w:val="23"/>
+  </w:num>
+  <w:num w:numId="36" w16cid:durableId="336272761">
+    <w:abstractNumId w:val="9"/>
+  </w:num>
+  <w:num w:numId="37" w16cid:durableId="1254247403">
+    <w:abstractNumId w:val="39"/>
+  </w:num>
+  <w:num w:numId="38" w16cid:durableId="986469637">
+    <w:abstractNumId w:val="22"/>
+  </w:num>
+  <w:num w:numId="39" w16cid:durableId="2061586596">
+    <w:abstractNumId w:val="37"/>
+  </w:num>
+  <w:num w:numId="40" w16cid:durableId="587540597">
+    <w:abstractNumId w:val="42"/>
+  </w:num>
+  <w:num w:numId="41" w16cid:durableId="1726953972">
+    <w:abstractNumId w:val="8"/>
+  </w:num>
+  <w:num w:numId="42" w16cid:durableId="75368089">
+    <w:abstractNumId w:val="48"/>
+  </w:num>
+  <w:num w:numId="43" w16cid:durableId="1617636502">
+    <w:abstractNumId w:val="34"/>
+  </w:num>
+  <w:num w:numId="44" w16cid:durableId="1929071272">
+    <w:abstractNumId w:val="15"/>
+  </w:num>
+  <w:num w:numId="45" w16cid:durableId="212355486">
     <w:abstractNumId w:val="40"/>
   </w:num>
-  <w:num w:numId="5" w16cid:durableId="1227767612">
+  <w:num w:numId="46" w16cid:durableId="2050840963">
+    <w:abstractNumId w:val="49"/>
+  </w:num>
+  <w:num w:numId="47" w16cid:durableId="1622490801">
+    <w:abstractNumId w:val="29"/>
+  </w:num>
+  <w:num w:numId="48" w16cid:durableId="2090418146">
+    <w:abstractNumId w:val="36"/>
+  </w:num>
+  <w:num w:numId="49" w16cid:durableId="458257872">
     <w:abstractNumId w:val="0"/>
   </w:num>
-  <w:num w:numId="6" w16cid:durableId="1946379767">
-    <w:abstractNumId w:val="16"/>
-  </w:num>
-  <w:num w:numId="7" w16cid:durableId="152913838">
-    <w:abstractNumId w:val="5"/>
-  </w:num>
-  <w:num w:numId="8" w16cid:durableId="1511604633">
-    <w:abstractNumId w:val="9"/>
-  </w:num>
-  <w:num w:numId="9" w16cid:durableId="553664727">
-    <w:abstractNumId w:val="30"/>
-  </w:num>
-  <w:num w:numId="10" w16cid:durableId="606348142">
-    <w:abstractNumId w:val="25"/>
-  </w:num>
-  <w:num w:numId="11" w16cid:durableId="1441602055">
-    <w:abstractNumId w:val="44"/>
-  </w:num>
-  <w:num w:numId="12" w16cid:durableId="1426800143">
-    <w:abstractNumId w:val="24"/>
-  </w:num>
-  <w:num w:numId="13" w16cid:durableId="626352584">
-    <w:abstractNumId w:val="4"/>
-  </w:num>
-  <w:num w:numId="14" w16cid:durableId="533227730">
-    <w:abstractNumId w:val="42"/>
-  </w:num>
-  <w:num w:numId="15" w16cid:durableId="1786315709">
-    <w:abstractNumId w:val="1"/>
-  </w:num>
-  <w:num w:numId="16" w16cid:durableId="988437533">
-    <w:abstractNumId w:val="15"/>
-  </w:num>
-  <w:num w:numId="17" w16cid:durableId="1370494364">
-    <w:abstractNumId w:val="8"/>
-  </w:num>
-  <w:num w:numId="18" w16cid:durableId="79714287">
-    <w:abstractNumId w:val="21"/>
-  </w:num>
-  <w:num w:numId="19" w16cid:durableId="243147022">
-    <w:abstractNumId w:val="18"/>
-  </w:num>
-  <w:num w:numId="20" w16cid:durableId="1300069373">
-    <w:abstractNumId w:val="28"/>
-  </w:num>
-  <w:num w:numId="21" w16cid:durableId="641036489">
-    <w:abstractNumId w:val="2"/>
-  </w:num>
-  <w:num w:numId="22" w16cid:durableId="618924859">
-    <w:abstractNumId w:val="10"/>
-  </w:num>
-  <w:num w:numId="23" w16cid:durableId="134833155">
-    <w:abstractNumId w:val="47"/>
-  </w:num>
-  <w:num w:numId="24" w16cid:durableId="239676937">
-    <w:abstractNumId w:val="3"/>
-  </w:num>
-  <w:num w:numId="25" w16cid:durableId="1881241021">
-    <w:abstractNumId w:val="29"/>
-  </w:num>
-  <w:num w:numId="26" w16cid:durableId="915165430">
-    <w:abstractNumId w:val="12"/>
-  </w:num>
-  <w:num w:numId="27" w16cid:durableId="1927374085">
-    <w:abstractNumId w:val="14"/>
-  </w:num>
-  <w:num w:numId="28" w16cid:durableId="1960259249">
-    <w:abstractNumId w:val="27"/>
-  </w:num>
-  <w:num w:numId="29" w16cid:durableId="836113632">
-    <w:abstractNumId w:val="43"/>
-  </w:num>
-  <w:num w:numId="30" w16cid:durableId="1985085924">
-    <w:abstractNumId w:val="41"/>
-  </w:num>
-  <w:num w:numId="31" w16cid:durableId="670451960">
-    <w:abstractNumId w:val="11"/>
-  </w:num>
-  <w:num w:numId="32" w16cid:durableId="989790267">
-    <w:abstractNumId w:val="38"/>
-  </w:num>
-  <w:num w:numId="33" w16cid:durableId="1605652317">
-    <w:abstractNumId w:val="22"/>
-  </w:num>
-  <w:num w:numId="34" w16cid:durableId="529029301">
-    <w:abstractNumId w:val="23"/>
-  </w:num>
-  <w:num w:numId="35" w16cid:durableId="1132821015">
-    <w:abstractNumId w:val="20"/>
-  </w:num>
-  <w:num w:numId="36" w16cid:durableId="336272761">
+  <w:num w:numId="50" w16cid:durableId="2045597261">
     <w:abstractNumId w:val="7"/>
   </w:num>
-  <w:num w:numId="37" w16cid:durableId="1254247403">
-    <w:abstractNumId w:val="36"/>
-  </w:num>
-  <w:num w:numId="38" w16cid:durableId="986469637">
+  <w:num w:numId="51" w16cid:durableId="1185285431">
     <w:abstractNumId w:val="19"/>
-  </w:num>
-  <w:num w:numId="39" w16cid:durableId="2061586596">
-    <w:abstractNumId w:val="34"/>
-  </w:num>
-  <w:num w:numId="40" w16cid:durableId="587540597">
-    <w:abstractNumId w:val="39"/>
-  </w:num>
-  <w:num w:numId="41" w16cid:durableId="1726953972">
-    <w:abstractNumId w:val="6"/>
-  </w:num>
-  <w:num w:numId="42" w16cid:durableId="75368089">
-    <w:abstractNumId w:val="45"/>
-  </w:num>
-  <w:num w:numId="43" w16cid:durableId="1617636502">
-    <w:abstractNumId w:val="31"/>
-  </w:num>
-  <w:num w:numId="44" w16cid:durableId="1929071272">
-    <w:abstractNumId w:val="13"/>
-  </w:num>
-  <w:num w:numId="45" w16cid:durableId="212355486">
-    <w:abstractNumId w:val="37"/>
-  </w:num>
-  <w:num w:numId="46" w16cid:durableId="2050840963">
-    <w:abstractNumId w:val="46"/>
-  </w:num>
-  <w:num w:numId="47" w16cid:durableId="1622490801">
-    <w:abstractNumId w:val="26"/>
-  </w:num>
-  <w:num w:numId="48" w16cid:durableId="2090418146">
-    <w:abstractNumId w:val="33"/>
   </w:num>
 </w:numbering>
 </file>
@@ -12499,7 +13370,6 @@
   <w:style w:type="character" w:default="1" w:styleId="DefaultParagraphFont">
     <w:name w:val="Default Paragraph Font"/>
     <w:uiPriority w:val="1"/>
-    <w:semiHidden/>
     <w:unhideWhenUsed/>
   </w:style>
   <w:style w:type="table" w:default="1" w:styleId="TableNormal">
@@ -12867,6 +13737,17 @@
       </w:tblBorders>
     </w:tblPr>
   </w:style>
+  <w:style w:type="paragraph" w:styleId="NormalWeb">
+    <w:name w:val="Normal (Web)"/>
+    <w:basedOn w:val="Normal"/>
+    <w:uiPriority w:val="99"/>
+    <w:semiHidden/>
+    <w:unhideWhenUsed/>
+    <w:rsid w:val="007F39E4"/>
+    <w:rPr>
+      <w:rFonts w:ascii="Times New Roman" w:hAnsi="Times New Roman" w:cs="Times New Roman"/>
+    </w:rPr>
+  </w:style>
 </w:styles>
 </file>
 

</xml_diff>